<commit_message>
Add AI interaction log and update HTML report
Add AI_INTERACTIONS.md to record the session interactions and update the results report and generator. Assignment2_Results_Report.html was expanded with instructions, dataset-goals, additional sections and charts, preserved scientific-notation values, and handling for mismatched vertex-count comparisons (marked as N/A). generate_html.py and README.md were updated to support the new report behavior and target parsing. A binary AI Usage Report.docx was also updated.
</commit_message>
<xml_diff>
--- a/Assignment_2_Polygon_Simplification/AI Usage Report.docx
+++ b/Assignment_2_Polygon_Simplification/AI Usage Report.docx
@@ -11,429 +11,443 @@
       <w:r>
         <w:rPr>
           <w:rFonts w:ascii="Arial" w:hAnsi="Arial" w:cs="Arial"/>
-        </w:rPr>
-        <w:t>AI Usage Report: Area-Preserving Segment Collapse Implementation</w:t>
-      </w:r>
-    </w:p>
-    <w:p>
-      <w:pPr>
-        <w:rPr>
-          <w:rFonts w:ascii="Arial" w:hAnsi="Arial" w:cs="Arial"/>
-        </w:rPr>
-      </w:pPr>
-      <w:r>
-        <w:rPr>
-          <w:rFonts w:ascii="Arial" w:hAnsi="Arial" w:cs="Arial"/>
-        </w:rPr>
-        <w:t>(a) Introduction</w:t>
-      </w:r>
-      <w:r>
-        <w:rPr>
-          <w:rFonts w:ascii="Arial" w:hAnsi="Arial" w:cs="Arial"/>
-        </w:rPr>
-        <w:br/>
-        <w:t>For this project, the main objective was to implement the Area-Preserving Segment Collapse (APSC) algorithm to simplify polygon data while preserving exact signed area and maintaining valid topology. I used Generative AI as a pair-programming assistant throughout the implementation process. My prompting strategy changed over time: I began with broad design questions such as which data structures would be suitable for polygon simplification, then gradually shifted toward focused implementation and debugging questions such as how to maintain a priority queue efficiently, how to manage linked-list updates safely, and how to validate program output against the required test cases.</w:t>
-      </w:r>
-    </w:p>
-    <w:p>
-      <w:pPr>
-        <w:rPr>
-          <w:rFonts w:ascii="Arial" w:hAnsi="Arial" w:cs="Arial"/>
-        </w:rPr>
-      </w:pPr>
-      <w:r>
-        <w:rPr>
-          <w:rFonts w:ascii="Arial" w:hAnsi="Arial" w:cs="Arial"/>
-        </w:rPr>
-        <w:t>The AI was most useful for accelerating routine programming tasks such as structuring classes, suggesting memory-safe patterns, and helping scaffold utility code. This allowed me to spend more time on the mathematically demanding parts of the project, especially translating the computational geometry ideas from Kronenfeld et al. (2020) into working C++ code. AI support was also valuable during the debugging phase, where I used it to help isolate mismatches between generated program output and the provided expected output files.</w:t>
-      </w:r>
-    </w:p>
-    <w:p>
-      <w:pPr>
-        <w:rPr>
-          <w:rFonts w:ascii="Arial" w:hAnsi="Arial" w:cs="Arial"/>
-        </w:rPr>
-      </w:pPr>
-      <w:r>
-        <w:rPr>
-          <w:rFonts w:ascii="Arial" w:hAnsi="Arial" w:cs="Arial"/>
-        </w:rPr>
-        <w:t>(b) Analysis of AI Suggestions</w:t>
-      </w:r>
-      <w:r>
-        <w:rPr>
-          <w:rFonts w:ascii="Arial" w:hAnsi="Arial" w:cs="Arial"/>
-        </w:rPr>
-        <w:br/>
-        <w:t>Critically evaluating the AI’s suggestions was essential, because its output included both strong architectural ideas and some incorrect or incomplete domain-specific logic.</w:t>
-      </w:r>
-    </w:p>
-    <w:p>
-      <w:pPr>
-        <w:rPr>
-          <w:rFonts w:ascii="Arial" w:hAnsi="Arial" w:cs="Arial"/>
-        </w:rPr>
-      </w:pPr>
-      <w:r>
-        <w:rPr>
-          <w:rFonts w:ascii="Arial" w:hAnsi="Arial" w:cs="Arial"/>
-        </w:rPr>
-        <w:t>Beneficial Suggestions:</w:t>
-      </w:r>
-      <w:r>
-        <w:rPr>
-          <w:rFonts w:ascii="Arial" w:hAnsi="Arial" w:cs="Arial"/>
-        </w:rPr>
-        <w:br/>
-        <w:t>• Data Structures: The AI correctly suggested that ordinary arrays or vectors alone would be inefficient for repeated local removals during simplification. Its recommendation to represent each polygon ring as a circular doubly linked list was important, because it allowed constant-time local updates when vertices were removed or inserted.</w:t>
-      </w:r>
-      <w:r>
-        <w:rPr>
-          <w:rFonts w:ascii="Arial" w:hAnsi="Arial" w:cs="Arial"/>
-        </w:rPr>
-        <w:br/>
-        <w:t>• Lazy Deletion: The AI proposed using an </w:t>
-      </w:r>
-      <w:proofErr w:type="spellStart"/>
-      <w:r>
-        <w:rPr>
-          <w:rFonts w:ascii="Arial" w:hAnsi="Arial" w:cs="Arial"/>
-        </w:rPr>
-        <w:t>isActive</w:t>
-      </w:r>
-      <w:proofErr w:type="spellEnd"/>
-      <w:r>
-        <w:rPr>
-          <w:rFonts w:ascii="Arial" w:hAnsi="Arial" w:cs="Arial"/>
-        </w:rPr>
-        <w:t> flag so that outdated vertices and stale queue entries could be ignored rather than removed immediately from the priority queue. This was a practical optimization because it avoided expensive queue rebuilds and kept operations efficient.</w:t>
-      </w:r>
-      <w:r>
-        <w:rPr>
-          <w:rFonts w:ascii="Arial" w:hAnsi="Arial" w:cs="Arial"/>
-        </w:rPr>
-        <w:br/>
-        <w:t>• Spatial Indexing: The AI suggested implementing a lightweight uniform spatial grid with </w:t>
-      </w:r>
-      <w:proofErr w:type="gramStart"/>
-      <w:r>
-        <w:rPr>
-          <w:rFonts w:ascii="Arial" w:hAnsi="Arial" w:cs="Arial"/>
-        </w:rPr>
-        <w:t>std::</w:t>
-      </w:r>
-      <w:proofErr w:type="spellStart"/>
-      <w:proofErr w:type="gramEnd"/>
-      <w:r>
-        <w:rPr>
-          <w:rFonts w:ascii="Arial" w:hAnsi="Arial" w:cs="Arial"/>
-        </w:rPr>
-        <w:t>unordered_map</w:t>
-      </w:r>
-      <w:proofErr w:type="spellEnd"/>
-      <w:r>
-        <w:rPr>
-          <w:rFonts w:ascii="Arial" w:hAnsi="Arial" w:cs="Arial"/>
-        </w:rPr>
-        <w:t> rather than relying on a heavy geometry library. This was helpful for fast topology checks and made the project self-contained.</w:t>
-      </w:r>
-      <w:r>
-        <w:rPr>
-          <w:rFonts w:ascii="Arial" w:hAnsi="Arial" w:cs="Arial"/>
-        </w:rPr>
-        <w:br/>
-        <w:t>• Code Structure: The AI helped organize the solution into separate modules for geometry, polygon representation, simplification, and spatial indexing. This separation made the code much easier to test and debug.</w:t>
-      </w:r>
-    </w:p>
-    <w:p>
-      <w:pPr>
-        <w:rPr>
-          <w:rFonts w:ascii="Arial" w:hAnsi="Arial" w:cs="Arial"/>
-        </w:rPr>
-      </w:pPr>
-      <w:r>
-        <w:rPr>
-          <w:rFonts w:ascii="Arial" w:hAnsi="Arial" w:cs="Arial"/>
-        </w:rPr>
-        <w:t>Misleading or Incorrect Output (Human Overrides):</w:t>
-      </w:r>
-      <w:r>
-        <w:rPr>
-          <w:rFonts w:ascii="Arial" w:hAnsi="Arial" w:cs="Arial"/>
-        </w:rPr>
-        <w:br/>
-        <w:t xml:space="preserve">• Sub-optimal Math Implementation: One early AI suggestion was to place the replacement vertex using a simpler geometric heuristic that preserved area but did </w:t>
+          <w:b/>
+          <w:bCs/>
+        </w:rPr>
+        <w:t># AI Usage Report</w:t>
+      </w:r>
+    </w:p>
+    <w:p>
+      <w:pPr>
+        <w:rPr>
+          <w:rFonts w:ascii="Arial" w:hAnsi="Arial" w:cs="Arial"/>
+        </w:rPr>
+      </w:pPr>
+    </w:p>
+    <w:p>
+      <w:pPr>
+        <w:rPr>
+          <w:rFonts w:ascii="Arial" w:hAnsi="Arial" w:cs="Arial"/>
+        </w:rPr>
+      </w:pPr>
+      <w:r>
+        <w:rPr>
+          <w:rFonts w:ascii="Arial" w:hAnsi="Arial" w:cs="Arial"/>
+          <w:b/>
+          <w:bCs/>
+        </w:rPr>
+        <w:t>## Introduction</w:t>
+      </w:r>
+    </w:p>
+    <w:p>
+      <w:pPr>
+        <w:rPr>
+          <w:rFonts w:ascii="Arial" w:hAnsi="Arial" w:cs="Arial"/>
+        </w:rPr>
+      </w:pPr>
+    </w:p>
+    <w:p>
+      <w:pPr>
+        <w:rPr>
+          <w:rFonts w:ascii="Arial" w:hAnsi="Arial" w:cs="Arial"/>
+        </w:rPr>
+      </w:pPr>
+      <w:r>
+        <w:rPr>
+          <w:rFonts w:ascii="Arial" w:hAnsi="Arial" w:cs="Arial"/>
+        </w:rPr>
+        <w:t>This project implements area-and-topology-preserving polygon simplification using Area-Preserving Segment Collapse (APSC) as the core idea. Generative AI was used as a coding and debugging assistant throughout the work. My prompting strategy changed over time. At the beginning, I asked broad design questions about how to represent polygon rings, what data structures would support repeated local edits, and how to maintain topological validity efficiently. Later, the prompts became more specific and task-oriented: how to manage a priority queue with stale entries, how to structure linked-list updates safely, how to compare generated outputs against expected files, and how to present the results clearly in the HTML report.</w:t>
+      </w:r>
+    </w:p>
+    <w:p>
+      <w:pPr>
+        <w:rPr>
+          <w:rFonts w:ascii="Arial" w:hAnsi="Arial" w:cs="Arial"/>
+        </w:rPr>
+      </w:pPr>
+    </w:p>
+    <w:p>
+      <w:pPr>
+        <w:rPr>
+          <w:rFonts w:ascii="Arial" w:hAnsi="Arial" w:cs="Arial"/>
+        </w:rPr>
+      </w:pPr>
+      <w:r>
+        <w:rPr>
+          <w:rFonts w:ascii="Arial" w:hAnsi="Arial" w:cs="Arial"/>
+        </w:rPr>
+        <w:t xml:space="preserve">AI was most helpful on tasks where a strong programming pattern </w:t>
+      </w:r>
+      <w:r>
+        <w:rPr>
+          <w:rFonts w:ascii="Arial" w:hAnsi="Arial" w:cs="Arial"/>
+        </w:rPr>
+        <w:t>existed,</w:t>
+      </w:r>
+      <w:r>
+        <w:rPr>
+          <w:rFonts w:ascii="Arial" w:hAnsi="Arial" w:cs="Arial"/>
+        </w:rPr>
+        <w:t xml:space="preserve"> but the final implementation still needed human review. Examples include modularizing the code into geometry, polygon, simplifier, and spatial-index components; drafting boilerplate for parsing CSV files; and suggesting implementation patterns such as lazy deletion and </w:t>
+      </w:r>
+      <w:r>
+        <w:rPr>
+          <w:rFonts w:ascii="Arial" w:hAnsi="Arial" w:cs="Arial"/>
+        </w:rPr>
+        <w:t>neighbourhood</w:t>
+      </w:r>
+      <w:r>
+        <w:rPr>
+          <w:rFonts w:ascii="Arial" w:hAnsi="Arial" w:cs="Arial"/>
+        </w:rPr>
+        <w:t>-based updates. That support accelerated development, but it did not replace the need to verify the algorithmic details against the assignment requirements and the Kronenfeld et al. paper.</w:t>
+      </w:r>
+    </w:p>
+    <w:p>
+      <w:pPr>
+        <w:rPr>
+          <w:rFonts w:ascii="Arial" w:hAnsi="Arial" w:cs="Arial"/>
+        </w:rPr>
+      </w:pPr>
+    </w:p>
+    <w:p>
+      <w:pPr>
+        <w:rPr>
+          <w:rFonts w:ascii="Arial" w:hAnsi="Arial" w:cs="Arial"/>
+        </w:rPr>
+      </w:pPr>
+      <w:r>
+        <w:rPr>
+          <w:rFonts w:ascii="Arial" w:hAnsi="Arial" w:cs="Arial"/>
+          <w:b/>
+          <w:bCs/>
+        </w:rPr>
+        <w:t>## Analysis of AI Suggestions</w:t>
+      </w:r>
+    </w:p>
+    <w:p>
+      <w:pPr>
+        <w:rPr>
+          <w:rFonts w:ascii="Arial" w:hAnsi="Arial" w:cs="Arial"/>
+        </w:rPr>
+      </w:pPr>
+    </w:p>
+    <w:p>
+      <w:pPr>
+        <w:rPr>
+          <w:rFonts w:ascii="Arial" w:hAnsi="Arial" w:cs="Arial"/>
+        </w:rPr>
+      </w:pPr>
+      <w:r>
+        <w:rPr>
+          <w:rFonts w:ascii="Arial" w:hAnsi="Arial" w:cs="Arial"/>
+        </w:rPr>
+        <w:t xml:space="preserve">Several AI suggestions were clearly useful. First, the recommendation to represent each ring as a circular doubly linked list was important because APSC repeatedly removes and reconnects local </w:t>
+      </w:r>
+      <w:r>
+        <w:rPr>
+          <w:rFonts w:ascii="Arial" w:hAnsi="Arial" w:cs="Arial"/>
+        </w:rPr>
+        <w:t>neighbourhoods</w:t>
+      </w:r>
+      <w:r>
+        <w:rPr>
+          <w:rFonts w:ascii="Arial" w:hAnsi="Arial" w:cs="Arial"/>
+        </w:rPr>
+        <w:t>. A plain array-based representation would have made those local edits much more expensive. Second, the suggestion to use lazy invalidation for vertices and queue entries helped keep the candidate-selection logic efficient. Rather than rebuilding the entire priority queue every time a nearby collapse changed the local geometry, the implementation can discard stale entries when they rise to the top. Third, the AI suggested using a lightweight spatial grid for topology checks, which fit the project well because it kept the code self-contained while still reducing the cost of intersection testing.</w:t>
+      </w:r>
+    </w:p>
+    <w:p>
+      <w:pPr>
+        <w:rPr>
+          <w:rFonts w:ascii="Arial" w:hAnsi="Arial" w:cs="Arial"/>
+        </w:rPr>
+      </w:pPr>
+    </w:p>
+    <w:p>
+      <w:pPr>
+        <w:rPr>
+          <w:rFonts w:ascii="Arial" w:hAnsi="Arial" w:cs="Arial"/>
+        </w:rPr>
+      </w:pPr>
+      <w:r>
+        <w:rPr>
+          <w:rFonts w:ascii="Arial" w:hAnsi="Arial" w:cs="Arial"/>
+        </w:rPr>
+        <w:t xml:space="preserve">Other suggestions were only partially correct and had to be revised. One early idea used a simpler heuristic for placing the replacement point `E`. Although it could </w:t>
       </w:r>
       <w:r>
         <w:rPr>
           <w:rFonts w:ascii="Arial" w:hAnsi="Arial" w:cs="Arial"/>
         </w:rPr>
         <w:lastRenderedPageBreak/>
-        <w:t>not minimize areal displacement correctly. This was not sufficient for the assignment requirements. I had to replace that logic with a more faithful implementation of the displacement minimization method described in the paper.</w:t>
-      </w:r>
-      <w:r>
-        <w:rPr>
-          <w:rFonts w:ascii="Arial" w:hAnsi="Arial" w:cs="Arial"/>
-        </w:rPr>
-        <w:br/>
-        <w:t>• Linked-List Logic Trap: The AI initially suggested marking a vertex inactive before calling the removal routine. This caused a hidden failure because the removal routine was already guarding against inactive vertices, so the linked-list pointers were never updated correctly. I had to trace the execution order manually and correct the logic.</w:t>
-      </w:r>
-      <w:r>
-        <w:rPr>
-          <w:rFonts w:ascii="Arial" w:hAnsi="Arial" w:cs="Arial"/>
-        </w:rPr>
-        <w:br/>
-        <w:t>• Memory Management Oversight: The first version did not fully account for dynamically allocated replacement vertices, which created the risk of leaks. I resolved this by maintaining master ownership through a container that tracks all allocated vertices and ensures they are deleted safely.</w:t>
-      </w:r>
-      <w:r>
-        <w:rPr>
-          <w:rFonts w:ascii="Arial" w:hAnsi="Arial" w:cs="Arial"/>
-        </w:rPr>
-        <w:br/>
-        <w:t xml:space="preserve">• Stale Priority Queue Candidates: During debugging, I discovered that some collapse candidates in the priority queue were still “active” but no longer represented four consecutive vertices after nearby collapses had modified the ring. This caused </w:t>
-      </w:r>
-      <w:proofErr w:type="gramStart"/>
-      <w:r>
-        <w:rPr>
-          <w:rFonts w:ascii="Arial" w:hAnsi="Arial" w:cs="Arial"/>
-        </w:rPr>
-        <w:t>valid-looking</w:t>
-      </w:r>
-      <w:proofErr w:type="gramEnd"/>
-      <w:r>
-        <w:rPr>
-          <w:rFonts w:ascii="Arial" w:hAnsi="Arial" w:cs="Arial"/>
-        </w:rPr>
-        <w:t xml:space="preserve"> but outdated operations to remain eligible for execution. I corrected this by adding an explicit </w:t>
-      </w:r>
-      <w:proofErr w:type="spellStart"/>
-      <w:r>
-        <w:rPr>
-          <w:rFonts w:ascii="Arial" w:hAnsi="Arial" w:cs="Arial"/>
-        </w:rPr>
-        <w:t>neighborhood</w:t>
-      </w:r>
-      <w:proofErr w:type="spellEnd"/>
-      <w:r>
-        <w:rPr>
-          <w:rFonts w:ascii="Arial" w:hAnsi="Arial" w:cs="Arial"/>
-        </w:rPr>
-        <w:t xml:space="preserve"> check before applying a candidate, so only still-consecutive A-B-C-D sequences can be collapsed.</w:t>
-      </w:r>
-      <w:r>
-        <w:rPr>
-          <w:rFonts w:ascii="Arial" w:hAnsi="Arial" w:cs="Arial"/>
-        </w:rPr>
-        <w:br/>
-        <w:t>• Test Case Interpretation Issues: While validating the output, I found that the rectangle test case in the README listed a target of 7, while the provided expected output actually contained 11 output vertices. This mismatch showed that test documentation itself may need verification, not just the program logic.</w:t>
-      </w:r>
-      <w:r>
-        <w:rPr>
-          <w:rFonts w:ascii="Arial" w:hAnsi="Arial" w:cs="Arial"/>
-        </w:rPr>
-        <w:br/>
-        <w:t xml:space="preserve">• Environment and Binary Confusion: Another debugging issue was that a checked-in executable and a rebuilt executable could produce different results if the wrong binary was run. I had to verify which executable was </w:t>
-      </w:r>
-      <w:proofErr w:type="gramStart"/>
-      <w:r>
-        <w:rPr>
-          <w:rFonts w:ascii="Arial" w:hAnsi="Arial" w:cs="Arial"/>
-        </w:rPr>
-        <w:t>actually being</w:t>
-      </w:r>
-      <w:proofErr w:type="gramEnd"/>
-      <w:r>
-        <w:rPr>
-          <w:rFonts w:ascii="Arial" w:hAnsi="Arial" w:cs="Arial"/>
-        </w:rPr>
-        <w:t xml:space="preserve"> executed and rebuild inside WSL to ensure that comparisons were being made against the current source code.</w:t>
-      </w:r>
-    </w:p>
-    <w:p>
-      <w:pPr>
-        <w:rPr>
-          <w:rFonts w:ascii="Arial" w:hAnsi="Arial" w:cs="Arial"/>
-        </w:rPr>
-      </w:pPr>
-      <w:r>
-        <w:rPr>
-          <w:rFonts w:ascii="Arial" w:hAnsi="Arial" w:cs="Arial"/>
-        </w:rPr>
-        <w:t>(c) Reflection on AI Assistance</w:t>
-      </w:r>
-      <w:r>
-        <w:rPr>
-          <w:rFonts w:ascii="Arial" w:hAnsi="Arial" w:cs="Arial"/>
-        </w:rPr>
-        <w:br/>
-        <w:t>Using AI changed my role significantly. Instead of spending most of my time writing routine C++ syntax from scratch, I spent more time acting as a reviewer, debugger, and system designer. The AI was very good at producing standard implementation patterns, such as data structure scaffolding, parsing logic, and modular file organization. It was also useful in proposing optimization ideas like lazy deletion and spatial indexing.</w:t>
-      </w:r>
-    </w:p>
-    <w:p>
-      <w:pPr>
-        <w:rPr>
-          <w:rFonts w:ascii="Arial" w:hAnsi="Arial" w:cs="Arial"/>
-        </w:rPr>
-      </w:pPr>
-      <w:r>
-        <w:rPr>
-          <w:rFonts w:ascii="Arial" w:hAnsi="Arial" w:cs="Arial"/>
-        </w:rPr>
-        <w:t xml:space="preserve">However, this project made it clear that AI cannot be trusted blindly, especially in computational geometry. The correctness of this assignment depended on subtle mathematical and topological conditions, and the AI often produced answers that were plausible </w:t>
-      </w:r>
-      <w:proofErr w:type="gramStart"/>
-      <w:r>
-        <w:rPr>
-          <w:rFonts w:ascii="Arial" w:hAnsi="Arial" w:cs="Arial"/>
-        </w:rPr>
-        <w:t>at a glance</w:t>
-      </w:r>
-      <w:proofErr w:type="gramEnd"/>
-      <w:r>
-        <w:rPr>
-          <w:rFonts w:ascii="Arial" w:hAnsi="Arial" w:cs="Arial"/>
-        </w:rPr>
-        <w:t xml:space="preserve"> but flawed in detail. Because of that, I had to validate every nontrivial suggestion against the paper, reason through pointer </w:t>
-      </w:r>
-      <w:proofErr w:type="spellStart"/>
-      <w:r>
-        <w:rPr>
-          <w:rFonts w:ascii="Arial" w:hAnsi="Arial" w:cs="Arial"/>
-        </w:rPr>
-        <w:t>behavior</w:t>
-      </w:r>
-      <w:proofErr w:type="spellEnd"/>
-      <w:r>
-        <w:rPr>
-          <w:rFonts w:ascii="Arial" w:hAnsi="Arial" w:cs="Arial"/>
-        </w:rPr>
-        <w:t xml:space="preserve"> manually, and verify the output empirically using the provided test cases.</w:t>
-      </w:r>
-    </w:p>
-    <w:p>
-      <w:pPr>
-        <w:rPr>
-          <w:rFonts w:ascii="Arial" w:hAnsi="Arial" w:cs="Arial"/>
-        </w:rPr>
-      </w:pPr>
-      <w:r>
-        <w:rPr>
-          <w:rFonts w:ascii="Arial" w:hAnsi="Arial" w:cs="Arial"/>
-        </w:rPr>
-        <w:t xml:space="preserve">The debugging process reinforced this lesson. AI was helpful in suggesting possible causes of mismatches, but the real progress came from systematic human-led </w:t>
-      </w:r>
-      <w:r>
-        <w:rPr>
-          <w:rFonts w:ascii="Arial" w:hAnsi="Arial" w:cs="Arial"/>
-        </w:rPr>
-        <w:lastRenderedPageBreak/>
-        <w:t xml:space="preserve">verification: rebuilding the executable, tracing algorithm </w:t>
-      </w:r>
-      <w:proofErr w:type="spellStart"/>
-      <w:r>
-        <w:rPr>
-          <w:rFonts w:ascii="Arial" w:hAnsi="Arial" w:cs="Arial"/>
-        </w:rPr>
-        <w:t>behavior</w:t>
-      </w:r>
-      <w:proofErr w:type="spellEnd"/>
-      <w:r>
-        <w:rPr>
-          <w:rFonts w:ascii="Arial" w:hAnsi="Arial" w:cs="Arial"/>
-        </w:rPr>
-        <w:t xml:space="preserve">, comparing outputs line by line, identifying stale queue </w:t>
-      </w:r>
-      <w:proofErr w:type="spellStart"/>
-      <w:r>
-        <w:rPr>
-          <w:rFonts w:ascii="Arial" w:hAnsi="Arial" w:cs="Arial"/>
-        </w:rPr>
-        <w:t>behavior</w:t>
-      </w:r>
-      <w:proofErr w:type="spellEnd"/>
-      <w:r>
-        <w:rPr>
-          <w:rFonts w:ascii="Arial" w:hAnsi="Arial" w:cs="Arial"/>
-        </w:rPr>
-        <w:t>, checking documentation inconsistencies, and confirming correctness with exact file diffs across all test cases. In that sense, AI functioned best as an accelerator and brainstorming assistant, while final correctness still depended on human judgment, testing discipline, and careful reasoning.</w:t>
-      </w:r>
-    </w:p>
-    <w:p>
-      <w:pPr>
-        <w:rPr>
-          <w:rFonts w:ascii="Arial" w:hAnsi="Arial" w:cs="Arial"/>
-        </w:rPr>
-      </w:pPr>
-      <w:r>
-        <w:rPr>
-          <w:rFonts w:ascii="Arial" w:hAnsi="Arial" w:cs="Arial"/>
-        </w:rPr>
-        <w:t>(d) Distribution of Work</w:t>
-      </w:r>
-      <w:r>
-        <w:rPr>
-          <w:rFonts w:ascii="Arial" w:hAnsi="Arial" w:cs="Arial"/>
-        </w:rPr>
-        <w:br/>
-        <w:t xml:space="preserve">• Generative AI: Assisted with drafting C++ boilerplate, proposing data structures, generating the </w:t>
-      </w:r>
-      <w:proofErr w:type="spellStart"/>
-      <w:r>
-        <w:rPr>
-          <w:rFonts w:ascii="Arial" w:hAnsi="Arial" w:cs="Arial"/>
-        </w:rPr>
-        <w:t>Makefile</w:t>
-      </w:r>
-      <w:proofErr w:type="spellEnd"/>
-      <w:r>
-        <w:rPr>
-          <w:rFonts w:ascii="Arial" w:hAnsi="Arial" w:cs="Arial"/>
-        </w:rPr>
-        <w:t>, helping structure the spatial grid, writing CSV parsing support, suggesting lazy deletion patterns, and assisting with troubleshooting strategies during debugging.</w:t>
-      </w:r>
-      <w:r>
-        <w:rPr>
-          <w:rFonts w:ascii="Arial" w:hAnsi="Arial" w:cs="Arial"/>
-        </w:rPr>
-        <w:br/>
-        <w:t xml:space="preserve">• Human (Myself [and Team Members if applicable]): Responsible for the overall system design, implementing and verifying the geometry logic, correcting flawed AI-generated linked-list and memory-management logic, identifying stale priority queue </w:t>
-      </w:r>
-      <w:proofErr w:type="spellStart"/>
-      <w:r>
-        <w:rPr>
-          <w:rFonts w:ascii="Arial" w:hAnsi="Arial" w:cs="Arial"/>
-        </w:rPr>
-        <w:t>behavior</w:t>
-      </w:r>
-      <w:proofErr w:type="spellEnd"/>
-      <w:r>
-        <w:rPr>
-          <w:rFonts w:ascii="Arial" w:hAnsi="Arial" w:cs="Arial"/>
-        </w:rPr>
-        <w:t xml:space="preserve">, resolving environment and binary issues, validating the discrepancy in the rectangle test specification, running full output comparisons against the provided expected files, and ensuring the final program </w:t>
-      </w:r>
-      <w:proofErr w:type="spellStart"/>
-      <w:r>
-        <w:rPr>
-          <w:rFonts w:ascii="Arial" w:hAnsi="Arial" w:cs="Arial"/>
-        </w:rPr>
-        <w:t>behavior</w:t>
-      </w:r>
-      <w:proofErr w:type="spellEnd"/>
-      <w:r>
-        <w:rPr>
-          <w:rFonts w:ascii="Arial" w:hAnsi="Arial" w:cs="Arial"/>
-        </w:rPr>
-        <w:t xml:space="preserve"> matched the assignment requirements exactly.</w:t>
-      </w:r>
-    </w:p>
-    <w:p>
-      <w:pPr>
-        <w:rPr>
-          <w:rFonts w:ascii="Arial" w:hAnsi="Arial" w:cs="Arial"/>
-        </w:rPr>
-      </w:pPr>
-    </w:p>
+        <w:t xml:space="preserve">preserve area, it did not reliably minimize areal displacement the way the assignment requires, so that logic had to be replaced by a more faithful implementation of the APSC approach. Another issue appeared in linked-list updates: one AI-generated version marked a vertex inactive too early, which prevented the actual </w:t>
+      </w:r>
+      <w:r>
+        <w:rPr>
+          <w:rFonts w:ascii="Arial" w:hAnsi="Arial" w:cs="Arial"/>
+        </w:rPr>
+        <w:t>neighbour</w:t>
+      </w:r>
+      <w:r>
+        <w:rPr>
+          <w:rFonts w:ascii="Arial" w:hAnsi="Arial" w:cs="Arial"/>
+        </w:rPr>
+        <w:t xml:space="preserve"> pointers from being rewired correctly. That bug could only be found by stepping through the code carefully and reasoning about the update order.</w:t>
+      </w:r>
+    </w:p>
+    <w:p>
+      <w:pPr>
+        <w:rPr>
+          <w:rFonts w:ascii="Arial" w:hAnsi="Arial" w:cs="Arial"/>
+        </w:rPr>
+      </w:pPr>
+    </w:p>
+    <w:p>
+      <w:pPr>
+        <w:rPr>
+          <w:rFonts w:ascii="Arial" w:hAnsi="Arial" w:cs="Arial"/>
+        </w:rPr>
+      </w:pPr>
+      <w:r>
+        <w:rPr>
+          <w:rFonts w:ascii="Arial" w:hAnsi="Arial" w:cs="Arial"/>
+        </w:rPr>
+        <w:t xml:space="preserve">The queue-management logic also needed human correction. Some collapse candidates remained technically present in the queue even after nearby edits had changed the local sequence of vertices. Those entries looked superficially valid, but they no longer represented the intended `A-B-C-D` </w:t>
+      </w:r>
+      <w:r>
+        <w:rPr>
+          <w:rFonts w:ascii="Arial" w:hAnsi="Arial" w:cs="Arial"/>
+        </w:rPr>
+        <w:t>neighbourhood</w:t>
+      </w:r>
+      <w:r>
+        <w:rPr>
+          <w:rFonts w:ascii="Arial" w:hAnsi="Arial" w:cs="Arial"/>
+        </w:rPr>
+        <w:t xml:space="preserve">. The fix was to explicitly revalidate the </w:t>
+      </w:r>
+      <w:r>
+        <w:rPr>
+          <w:rFonts w:ascii="Arial" w:hAnsi="Arial" w:cs="Arial"/>
+        </w:rPr>
+        <w:t>neighbourhood</w:t>
+      </w:r>
+      <w:r>
+        <w:rPr>
+          <w:rFonts w:ascii="Arial" w:hAnsi="Arial" w:cs="Arial"/>
+        </w:rPr>
+        <w:t xml:space="preserve"> before accepting a collapse. Finally, the work on benchmark matching showed that debugging had to include the documentation and workflow too, not only the algorithm. For example, the rectangle-with-two-holes case required careful interpretation of the target and final-vertex-count </w:t>
+      </w:r>
+      <w:r>
+        <w:rPr>
+          <w:rFonts w:ascii="Arial" w:hAnsi="Arial" w:cs="Arial"/>
+        </w:rPr>
+        <w:t>behaviour</w:t>
+      </w:r>
+      <w:r>
+        <w:rPr>
+          <w:rFonts w:ascii="Arial" w:hAnsi="Arial" w:cs="Arial"/>
+        </w:rPr>
+        <w:t>, and later the Makefile/README expectations for the deliverables also had to be aligned with the project requirements.</w:t>
+      </w:r>
+    </w:p>
+    <w:p>
+      <w:pPr>
+        <w:rPr>
+          <w:rFonts w:ascii="Arial" w:hAnsi="Arial" w:cs="Arial"/>
+        </w:rPr>
+      </w:pPr>
+    </w:p>
+    <w:p>
+      <w:pPr>
+        <w:rPr>
+          <w:rFonts w:ascii="Arial" w:hAnsi="Arial" w:cs="Arial"/>
+        </w:rPr>
+      </w:pPr>
+      <w:r>
+        <w:rPr>
+          <w:rFonts w:ascii="Arial" w:hAnsi="Arial" w:cs="Arial"/>
+          <w:b/>
+          <w:bCs/>
+        </w:rPr>
+        <w:t>## Reflection on AI Assistance</w:t>
+      </w:r>
+    </w:p>
+    <w:p>
+      <w:pPr>
+        <w:rPr>
+          <w:rFonts w:ascii="Arial" w:hAnsi="Arial" w:cs="Arial"/>
+        </w:rPr>
+      </w:pPr>
+    </w:p>
+    <w:p>
+      <w:pPr>
+        <w:rPr>
+          <w:rFonts w:ascii="Arial" w:hAnsi="Arial" w:cs="Arial"/>
+        </w:rPr>
+      </w:pPr>
+      <w:r>
+        <w:rPr>
+          <w:rFonts w:ascii="Arial" w:hAnsi="Arial" w:cs="Arial"/>
+        </w:rPr>
+        <w:t xml:space="preserve">Using AI changed the nature of the work. Instead of spending most of the time writing standard C++ syntax from scratch, I spent more time evaluating suggestions, checking invariants, and verifying </w:t>
+      </w:r>
+      <w:r>
+        <w:rPr>
+          <w:rFonts w:ascii="Arial" w:hAnsi="Arial" w:cs="Arial"/>
+        </w:rPr>
+        <w:t>behaviour</w:t>
+      </w:r>
+      <w:r>
+        <w:rPr>
+          <w:rFonts w:ascii="Arial" w:hAnsi="Arial" w:cs="Arial"/>
+        </w:rPr>
+        <w:t xml:space="preserve"> against the expected outputs. In that sense, AI worked best as a fast drafting and brainstorming partner. It was especially effective for repetitive scaffolding, refactoring, and presentation tasks such as reorganizing the report generator, improving chart readability, and formatting results consistently.</w:t>
+      </w:r>
+    </w:p>
+    <w:p>
+      <w:pPr>
+        <w:rPr>
+          <w:rFonts w:ascii="Arial" w:hAnsi="Arial" w:cs="Arial"/>
+        </w:rPr>
+      </w:pPr>
+    </w:p>
+    <w:p>
+      <w:pPr>
+        <w:rPr>
+          <w:rFonts w:ascii="Arial" w:hAnsi="Arial" w:cs="Arial"/>
+        </w:rPr>
+      </w:pPr>
+      <w:r>
+        <w:rPr>
+          <w:rFonts w:ascii="Arial" w:hAnsi="Arial" w:cs="Arial"/>
+        </w:rPr>
+        <w:t>At the same time, this project showed the limits of AI very clearly. Computational geometry is full of plausible-but-wrong answers: a suggested simplification step can look reasonable while still violating a subtle topological condition or increasing displacement in a way that only appears on a hard benchmark. Because of that, I could not accept nontrivial suggestions without verification. Human judgment was essential whenever the task depended on geometric correctness, ring topology, benchmarking interpretation, or honest documentation of what the implementation actually does. The most valuable lesson was that AI is strongest when used critically. It can speed up exploration, but the final responsibility for correctness, testing, and design still belongs to the developer.</w:t>
+      </w:r>
+    </w:p>
+    <w:p>
+      <w:pPr>
+        <w:rPr>
+          <w:rFonts w:ascii="Arial" w:hAnsi="Arial" w:cs="Arial"/>
+        </w:rPr>
+      </w:pPr>
+    </w:p>
+    <w:p>
+      <w:pPr>
+        <w:rPr>
+          <w:rFonts w:ascii="Arial" w:hAnsi="Arial" w:cs="Arial"/>
+        </w:rPr>
+      </w:pPr>
+      <w:r>
+        <w:rPr>
+          <w:rFonts w:ascii="Arial" w:hAnsi="Arial" w:cs="Arial"/>
+          <w:b/>
+          <w:bCs/>
+        </w:rPr>
+        <w:t>## Distribution of Work with AI and Within the Team</w:t>
+      </w:r>
+    </w:p>
+    <w:p>
+      <w:pPr>
+        <w:rPr>
+          <w:rFonts w:ascii="Arial" w:hAnsi="Arial" w:cs="Arial"/>
+        </w:rPr>
+      </w:pPr>
+    </w:p>
+    <w:p>
+      <w:pPr>
+        <w:rPr>
+          <w:rFonts w:ascii="Arial" w:hAnsi="Arial" w:cs="Arial"/>
+        </w:rPr>
+      </w:pPr>
+      <w:r>
+        <w:rPr>
+          <w:rFonts w:ascii="Arial" w:hAnsi="Arial" w:cs="Arial"/>
+        </w:rPr>
+        <w:t>AI contributed in several concrete ways. It helped draft code structure, suggested ring and queue data structures, proposed the spatial-grid idea for intersection checks, assisted with CSV and report-generation utilities, and supported debugging by surfacing likely causes when output files did not match expectations. It also helped improve the HTML report by adding charts, exact-value formatting, clearer visualizations, and rubric-oriented sections.</w:t>
+      </w:r>
+    </w:p>
+    <w:p>
+      <w:pPr>
+        <w:rPr>
+          <w:rFonts w:ascii="Arial" w:hAnsi="Arial" w:cs="Arial"/>
+        </w:rPr>
+      </w:pPr>
+    </w:p>
+    <w:p>
+      <w:pPr>
+        <w:rPr>
+          <w:rFonts w:ascii="Arial" w:hAnsi="Arial" w:cs="Arial"/>
+        </w:rPr>
+      </w:pPr>
+      <w:r>
+        <w:rPr>
+          <w:rFonts w:ascii="Arial" w:hAnsi="Arial" w:cs="Arial"/>
+        </w:rPr>
+        <w:t xml:space="preserve">The human contribution was responsible for the core engineering decisions and all final validation. I chose which AI suggestions to adopt, corrected the incorrect ones, and verified the implementation against the instructor outputs. I also handled the algorithm-specific reasoning needed to prevent stale collapses, protect the exterior ring from pathological over-simplification, and bias candidate selection toward lower-displacement outcomes. On the reporting side, I checked the rubric requirements and adjusted the README and HTML </w:t>
+      </w:r>
+      <w:r>
+        <w:rPr>
+          <w:rFonts w:ascii="Arial" w:hAnsi="Arial" w:cs="Arial"/>
+        </w:rPr>
+        <w:t>report,</w:t>
+      </w:r>
+      <w:r>
+        <w:rPr>
+          <w:rFonts w:ascii="Arial" w:hAnsi="Arial" w:cs="Arial"/>
+        </w:rPr>
+        <w:t xml:space="preserve"> so the deliverables reflected the actual state of the project rather than an idealized description.</w:t>
+      </w:r>
+    </w:p>
+    <w:p>
+      <w:pPr>
+        <w:rPr>
+          <w:rFonts w:ascii="Arial" w:hAnsi="Arial" w:cs="Arial"/>
+        </w:rPr>
+      </w:pPr>
+    </w:p>
+    <w:p>
+      <w:pPr>
+        <w:rPr>
+          <w:rFonts w:ascii="Arial" w:hAnsi="Arial" w:cs="Arial"/>
+        </w:rPr>
+      </w:pPr>
+      <w:r>
+        <w:rPr>
+          <w:rFonts w:ascii="Arial" w:hAnsi="Arial" w:cs="Arial"/>
+        </w:rPr>
+        <w:t>If this repository is submitted as a team project, the human side of the work should be expanded to name the individual responsibilities of the teammates. In the current text, the human role is written from the perspective of the repository owner and the recorded working session.</w:t>
+      </w:r>
+    </w:p>
+    <w:p>
+      <w:pPr>
+        <w:rPr>
+          <w:rFonts w:ascii="Arial" w:hAnsi="Arial" w:cs="Arial"/>
+        </w:rPr>
+      </w:pPr>
+    </w:p>
+    <w:p>
+      <w:pPr>
+        <w:rPr>
+          <w:rFonts w:ascii="Arial" w:hAnsi="Arial" w:cs="Arial"/>
+        </w:rPr>
+      </w:pPr>
+      <w:r>
+        <w:rPr>
+          <w:rFonts w:ascii="Arial" w:hAnsi="Arial" w:cs="Arial"/>
+        </w:rPr>
+        <w:t>Word count: 909</w:t>
+      </w:r>
+    </w:p>
+    <w:p>
+      <w:pPr>
+        <w:rPr>
+          <w:rFonts w:ascii="Arial" w:hAnsi="Arial" w:cs="Arial"/>
+        </w:rPr>
+      </w:pPr>
+    </w:p>
+    <w:p/>
     <w:sectPr>
       <w:pgSz w:w="11906" w:h="16838"/>
       <w:pgMar w:top="1440" w:right="1440" w:bottom="1440" w:left="1440" w:header="708" w:footer="708" w:gutter="0"/>

</xml_diff>